<commit_message>
Fixes from site review
- Remove the TAVIP section from the Method page and its Word document;
  the collaboration has not been agreed
- Fix malformed table headers (thead was rewritten as th)
- Use they/them in llms.txt
- Add contents lists to the Principle and Method pages
- Add contact to every page footer
- Correct Zero Information Casualties to the singular name
- Accessibility statement: WCAG 2.2 AA baseline, testing, no audit
  claim, review date

Co-Authored-By: Claude Opus 5.5 <noreply@anthropic.com>
Claude-Session: https://claude.ai/code/session_01SwFwNBZR1G5YWJWaYUBpLC
</commit_message>
<xml_diff>
--- a/site/files/Agent-First-Accessible-Service-Design-v1.0.docx
+++ b/site/files/Agent-First-Accessible-Service-Design-v1.0.docx
@@ -1380,30 +1380,6 @@
       </w:pPr>
       <w:r>
         <w:t>Migration constraints should be understood early, but they must not turn the new logical design into a reproduction of the existing website. The objective is continuity of service without continuity of unnecessary limitations.</w:t>
-      </w:r>
-    </w:p>
-    <w:p>
-      <w:pPr>
-        <w:pStyle w:val="Heading1"/>
-      </w:pPr>
-      <w:r>
-        <w:t>A practical first case: TAVIP</w:t>
-      </w:r>
-    </w:p>
-    <w:p>
-      <w:pPr>
-        <w:spacing w:after="160" w:line="300" w:lineRule="auto"/>
-      </w:pPr>
-      <w:r>
-        <w:t>The Technology Association of Visually Impaired People (TAVIP) offers a suitable first opportunity to explore the method. The proposed starting point is an outside-in examination of TAVIP’s publicly available website and services. The aim is not merely to find accessibility defects or replace one set of pages with another. It is to reconstruct the underlying service model, identify what members and prospective members want to achieve, and demonstrate how those services could work through accessible direct interaction and authorised agents.</w:t>
-      </w:r>
-    </w:p>
-    <w:p>
-      <w:pPr>
-        <w:spacing w:after="160" w:line="300" w:lineRule="auto"/>
-      </w:pPr>
-      <w:r>
-        <w:t>A small pilot covering one complete service journey could establish whether the approach delivers practical value. The wider questions of delegated authority and agent-mediated member services could also give useful material to an organisational AI working group. The project is currently a proposal rather than an agreed collaboration. Any implementation, use of organisational information or publication of a joint case study would require TAVIP’s agreement.</w:t>
       </w:r>
     </w:p>
     <w:p>

</xml_diff>